<commit_message>
Reframe to scanner-normalized, covariate-adjusted T2 analysis
Re-centers the analysis on the defensible primary: cord-normalized paraspinal/
iliopsoas T2 signal, adjusted for age, sex, and baseline, predicting change in
PROMIS Physical Health and ODI over time. This confirms and extends the group's
prior unadjusted raw-T2 finding (3M PH p<0.001; 3M ODI p=0.005) and additionally
recovers a durable 1-year ODI effect (p=0.023). Retains the T2-heterogeneity ->
MCID result as a labeled secondary finding (iliopsoas ODI MCID OR 0.60). Adds
PROMIS Global Physical Health outcome and the timecourse model/figure; rewrites
the abstract and rebuilds the Word package; softens the myosteatosis framing
(higher T2 tracks better recovery, consistent with reversible edema).
</commit_message>
<xml_diff>
--- a/docs/Abstract_with_figures.docx
+++ b/docs/Abstract_with_figures.docx
@@ -13,7 +13,7 @@
           <w:sz w:val="30"/>
           <w:szCs w:val="30"/>
         </w:rPr>
-        <w:t xml:space="preserve">Iliopsoas Fatty Infiltration, Not Muscle Volume, Predicts Failure to Achieve a Minimal Clinically Important Difference After Lumbar Decompression</w:t>
+        <w:t xml:space="preserve">Scanner-Normalized Paraspinal and Iliopsoas Muscle T2 Signal Predicts Functional Recovery After Lumbar Decompression: A Covariate-Adjusted Analysis</w:t>
       </w:r>
     </w:p>
     <w:p>
@@ -43,7 +43,7 @@
         <w:t xml:space="preserve">Authors: </w:t>
       </w:r>
       <w:r>
-        <w:t xml:space="preserve">Jimena Gonzales; [co-authors]; Niels Pacheco-Barrios</w:t>
+        <w:t xml:space="preserve">Jimena Gonzalez-Salido; Niels Pacheco-Barrios; [co-authors]; Ziev B. Moses; Martina Stippler</w:t>
       </w:r>
     </w:p>
     <w:p>
@@ -66,7 +66,7 @@
         <w:t xml:space="preserve">Introduction.  </w:t>
       </w:r>
       <w:r>
-        <w:t xml:space="preserve">Paraspinal muscle status has been associated with outcomes after spine surgery, but most evidence comes from fusion cohorts or single-slice cross-sectional area, and its prognostic value after decompression is unclear, particularly whether muscle quantity or quality matters.</w:t>
+        <w:t xml:space="preserve">Paraspinal and iliopsoas muscle quality on MRI may predict recovery after lumbar decompression, but prior analyses used raw, scanner-dependent T2 intensity and unadjusted correlations, conflating muscle biology with acquisition.</w:t>
       </w:r>
     </w:p>
     <w:p>
@@ -81,7 +81,7 @@
         <w:t xml:space="preserve">Objective.  </w:t>
       </w:r>
       <w:r>
-        <w:t xml:space="preserve">To determine whether preoperative volumetric size or fatty infiltration of the iliopsoas and paraspinal muscles predicts achievement of a minimal clinically important difference (MCID) one year after lumbar decompression.</w:t>
+        <w:t xml:space="preserve">To test whether scanner-normalized T2 signal and T2 heterogeneity of the paraspinal and iliopsoas muscles predict functional recovery after lumbar decompression.</w:t>
       </w:r>
     </w:p>
     <w:p>
@@ -96,7 +96,7 @@
         <w:t xml:space="preserve">Methods.  </w:t>
       </w:r>
       <w:r>
-        <w:t xml:space="preserve">In a retrospective cohort undergoing lumbar decompression, preoperative MRI underwent volumetric segmentation of the iliopsoas, deep back, and gluteus medius muscles (n=385; mean age 62.8±13.3 years; 47% female). For each muscle we computed bilateral volume (normalized to vertebral-body volume) and fatty infiltration, indexed by intramuscular signal heterogeneity (coefficient of variation and normalized interpercentile spread); all exposures were standardized. Multivariable logistic regression modeled MCID attainment on the Oswestry Disability Index (≥12.8) and PROMIS Physical Function (≥4.5) at one year, adjusting for age, sex, and baseline score, yielding odds ratios per standard deviation. Radicular leg pain served as a prespecified negative control.</w:t>
+        <w:t xml:space="preserve">In a retrospective cohort (n=385; mean age 62.8±13.4 years; 47% female), preoperative T2-weighted MRI underwent 3D segmentation of the iliopsoas and deep back muscles. Mean muscle T2 was normalized to spinal-cord signal (scanner-robust), and intramuscular heterogeneity indexed by the coefficient of variation; exposures were standardized. Multivariable regression modeled change in PROMIS Global Physical Health and Oswestry Disability Index (ODI) from 6 weeks to 1 year, adjusting for age, sex, and baseline (per 1 SD). Logistic regression modeled attainment of a minimal clinically important difference (MCID; ODI ≥12.8, PROMIS Physical Function ≥4.5). Radicular leg pain was a prespecified negative control.</w:t>
       </w:r>
     </w:p>
     <w:p>
@@ -111,7 +111,7 @@
         <w:t xml:space="preserve">Results.  </w:t>
       </w:r>
       <w:r>
-        <w:t xml:space="preserve">161 and 169 patients had one-year ODI and PROMIS-PF; 61% and 67% achieved MCID (mean ODI 48.6→27.4; PROMIS-PF 33.7→41.6). Muscle volume was not associated with MCID for any muscle (all p&gt;0.40). Greater iliopsoas fatty infiltration was associated with lower odds of achieving ODI MCID (OR 0.60 per SD; 95% CI 0.40–0.91; p=0.015) and PROMIS-PF MCID (OR 0.70; 0.48–1.02; p=0.06), independent of volume (OR 0.66; p=0.033). Associations were specific to the iliopsoas; the deep back, gluteus medius, and the leg-pain negative control were null.</w:t>
+        <w:t xml:space="preserve">Higher cord-normalized iliopsoas T2 predicted greater improvement in PROMIS Physical Health at 3 months (β=+1.11; 95% CI 0.54 to 1.69; p&lt;0.001) and greater ODI reduction at 3 months (β=−3.05; −5.19 to −0.90; p=0.005) and 1 year (β=−2.40; −4.48 to −0.32; p=0.023); the deep back muscle showed concordant 3-month effects (PH p=0.027; ODI p=0.050). Greater iliopsoas T2 heterogeneity predicted lower odds of ODI MCID (OR 0.60; 0.40 to 0.91; p=0.015) and PROMIS-PF MCID (OR 0.70; 0.48 to 1.02; p=0.06), independent of volume. Volume and back/leg pain showed no associations.</w:t>
       </w:r>
     </w:p>
     <w:p>
@@ -126,7 +126,7 @@
         <w:t xml:space="preserve">Conclusion.  </w:t>
       </w:r>
       <w:r>
-        <w:t xml:space="preserve">After lumbar decompression, muscle quality (iliopsoas fatty infiltration), rather than muscle volume, predicted failure to achieve clinically meaningful improvement in disability and physical function. The iliopsoas may inform preoperative risk stratification and prehabilitation. These exploratory findings should be confirmed with quantitative fat-fraction imaging.</w:t>
+        <w:t xml:space="preserve">Scanner-normalized paraspinal and iliopsoas T2 signal independently predicted early functional and disability improvement after lumbar decompression, including a durable 1-year disability effect not evident in unadjusted raw-signal analyses, whereas greater T2 heterogeneity predicted lower odds of clinically meaningful improvement. Higher T2 tracking better recovery suggests reversible edema or inflammation rather than chronic fat; quantitative fat-water imaging is warranted.</w:t>
       </w:r>
     </w:p>
     <w:p>
@@ -145,9 +145,9 @@
       <w:r>
         <w:drawing>
           <wp:inline distT="0" distB="0" distL="0" distR="0">
-            <wp:extent cx="5943600" cy="2943225"/>
+            <wp:extent cx="5143500" cy="5143500"/>
             <wp:effectExtent t="0" r="0" b="0" l="0"/>
-            <wp:docPr id="1" name="graphical_abstract.png" descr="Figure 1. Visual summary. (A) Achievement of Oswestry Disability Index (ODI) MCID at one year declines across tertiles of preoperative iliopsoas fatty infiltration. (B) PROMIS Physical Function recovery over 24 months by low versus high iliopsoas fatty infiltration (median split). Error bars, 95% CI." title="Figure 1. Visual summary. (A) Achievement of Oswestry Disability Index (ODI) MCID at one year declines across tertiles of preoperative iliopsoas fatty infiltration. (B) PROMIS Physical Function recovery over 24 months by low versus high iliopsoas fatty infiltration (median split). Error bars, 95% CI."/>
+            <wp:docPr id="1" name="forest_t2_timecourse.png" descr="Figure 1. Primary analysis. Adjusted per-SD effect of cord-normalized paraspinal and iliopsoas T2 signal on change in PROMIS Physical Health and the Oswestry Disability Index across postoperative timepoints (age-, sex-, and baseline-adjusted; HC3 robust SE). For PH, positive values indicate improvement; for ODI, negative values indicate improvement. Reference line at 0." title="Figure 1. Primary analysis. Adjusted per-SD effect of cord-normalized paraspinal and iliopsoas T2 signal on change in PROMIS Physical Health and the Oswestry Disability Index across postoperative timepoints (age-, sex-, and baseline-adjusted; HC3 robust SE). For PH, positive values indicate improvement; for ODI, negative values indicate improvement. Reference line at 0."/>
             <wp:cNvGraphicFramePr>
               <a:graphicFrameLocks xmlns:a="http://schemas.openxmlformats.org/drawingml/2006/main" noChangeAspect="1"/>
             </wp:cNvGraphicFramePr>
@@ -170,7 +170,7 @@
                   <pic:spPr bwMode="auto">
                     <a:xfrm>
                       <a:off x="0" y="0"/>
-                      <a:ext cx="5943600" cy="2943225"/>
+                      <a:ext cx="5143500" cy="5143500"/>
                     </a:xfrm>
                     <a:prstGeom prst="rect">
                       <a:avLst/>
@@ -194,7 +194,7 @@
           <w:sz w:val="18"/>
           <w:szCs w:val="18"/>
         </w:rPr>
-        <w:t xml:space="preserve">Figure 1. Visual summary. (A) Achievement of Oswestry Disability Index (ODI) MCID at one year declines across tertiles of preoperative iliopsoas fatty infiltration. (B) PROMIS Physical Function recovery over 24 months by low versus high iliopsoas fatty infiltration (median split). Error bars, 95% CI.</w:t>
+        <w:t xml:space="preserve">Figure 1. Primary analysis. Adjusted per-SD effect of cord-normalized paraspinal and iliopsoas T2 signal on change in PROMIS Physical Health and the Oswestry Disability Index across postoperative timepoints (age-, sex-, and baseline-adjusted; HC3 robust SE). For PH, positive values indicate improvement; for ODI, negative values indicate improvement. Reference line at 0.</w:t>
       </w:r>
     </w:p>
     <w:p>
@@ -205,9 +205,9 @@
       <w:r>
         <w:drawing>
           <wp:inline distT="0" distB="0" distL="0" distR="0">
-            <wp:extent cx="5334000" cy="4171950"/>
+            <wp:extent cx="5943600" cy="2943225"/>
             <wp:effectExtent t="0" r="0" b="0" l="0"/>
-            <wp:docPr id="1" name="forest_mcid.png" descr="Figure 2. Adjusted odds ratios (per 1 SD) for achieving MCID at one year, contrasting muscle size (spine-normalized volume) with quality (fatty-infiltration texture) for each muscle. Logistic regression adjusted for age, sex, and baseline score; reference line at OR=1." title="Figure 2. Adjusted odds ratios (per 1 SD) for achieving MCID at one year, contrasting muscle size (spine-normalized volume) with quality (fatty-infiltration texture) for each muscle. Logistic regression adjusted for age, sex, and baseline score; reference line at OR=1."/>
+            <wp:docPr id="1" name="graphical_abstract.png" descr="Figure 2. Visual summary of the secondary heterogeneity analysis. (A) Achievement of ODI MCID at one year by tertile of preoperative iliopsoas T2 heterogeneity. (B) PROMIS Physical Function recovery by low versus high heterogeneity. Error bars, 95% CI." title="Figure 2. Visual summary of the secondary heterogeneity analysis. (A) Achievement of ODI MCID at one year by tertile of preoperative iliopsoas T2 heterogeneity. (B) PROMIS Physical Function recovery by low versus high heterogeneity. Error bars, 95% CI."/>
             <wp:cNvGraphicFramePr>
               <a:graphicFrameLocks xmlns:a="http://schemas.openxmlformats.org/drawingml/2006/main" noChangeAspect="1"/>
             </wp:cNvGraphicFramePr>
@@ -230,7 +230,7 @@
                   <pic:spPr bwMode="auto">
                     <a:xfrm>
                       <a:off x="0" y="0"/>
-                      <a:ext cx="5334000" cy="4171950"/>
+                      <a:ext cx="5943600" cy="2943225"/>
                     </a:xfrm>
                     <a:prstGeom prst="rect">
                       <a:avLst/>
@@ -254,7 +254,7 @@
           <w:sz w:val="18"/>
           <w:szCs w:val="18"/>
         </w:rPr>
-        <w:t xml:space="preserve">Figure 2. Adjusted odds ratios (per 1 SD) for achieving MCID at one year, contrasting muscle size (spine-normalized volume) with quality (fatty-infiltration texture) for each muscle. Logistic regression adjusted for age, sex, and baseline score; reference line at OR=1.</w:t>
+        <w:t xml:space="preserve">Figure 2. Visual summary of the secondary heterogeneity analysis. (A) Achievement of ODI MCID at one year by tertile of preoperative iliopsoas T2 heterogeneity. (B) PROMIS Physical Function recovery by low versus high heterogeneity. Error bars, 95% CI.</w:t>
       </w:r>
     </w:p>
     <w:p>
@@ -265,9 +265,9 @@
       <w:r>
         <w:drawing>
           <wp:inline distT="0" distB="0" distL="0" distR="0">
-            <wp:extent cx="5143500" cy="2876550"/>
+            <wp:extent cx="5334000" cy="4171950"/>
             <wp:effectExtent t="0" r="0" b="0" l="0"/>
-            <wp:docPr id="1" name="mcid_by_tertile.png" descr="Figure 3. Percentage achieving ODI and PROMIS Physical Function MCID at one year across iliopsoas fatty-infiltration tertiles. Error bars, Wilson 95% CI; n shown per bar." title="Figure 3. Percentage achieving ODI and PROMIS Physical Function MCID at one year across iliopsoas fatty-infiltration tertiles. Error bars, Wilson 95% CI; n shown per bar."/>
+            <wp:docPr id="1" name="forest_mcid.png" descr="Figure 3. Secondary analysis. Adjusted odds ratios (per 1 SD) for achieving MCID at one year, contrasting muscle size (spine-normalized volume) with quality (T2 heterogeneity) for each muscle; reference line at OR=1." title="Figure 3. Secondary analysis. Adjusted odds ratios (per 1 SD) for achieving MCID at one year, contrasting muscle size (spine-normalized volume) with quality (T2 heterogeneity) for each muscle; reference line at OR=1."/>
             <wp:cNvGraphicFramePr>
               <a:graphicFrameLocks xmlns:a="http://schemas.openxmlformats.org/drawingml/2006/main" noChangeAspect="1"/>
             </wp:cNvGraphicFramePr>
@@ -290,7 +290,7 @@
                   <pic:spPr bwMode="auto">
                     <a:xfrm>
                       <a:off x="0" y="0"/>
-                      <a:ext cx="5143500" cy="2876550"/>
+                      <a:ext cx="5334000" cy="4171950"/>
                     </a:xfrm>
                     <a:prstGeom prst="rect">
                       <a:avLst/>
@@ -314,7 +314,7 @@
           <w:sz w:val="18"/>
           <w:szCs w:val="18"/>
         </w:rPr>
-        <w:t xml:space="preserve">Figure 3. Percentage achieving ODI and PROMIS Physical Function MCID at one year across iliopsoas fatty-infiltration tertiles. Error bars, Wilson 95% CI; n shown per bar.</w:t>
+        <w:t xml:space="preserve">Figure 3. Secondary analysis. Adjusted odds ratios (per 1 SD) for achieving MCID at one year, contrasting muscle size (spine-normalized volume) with quality (T2 heterogeneity) for each muscle; reference line at OR=1.</w:t>
       </w:r>
     </w:p>
     <w:p>
@@ -325,9 +325,9 @@
       <w:r>
         <w:drawing>
           <wp:inline distT="0" distB="0" distL="0" distR="0">
-            <wp:extent cx="4476750" cy="3133725"/>
+            <wp:extent cx="5143500" cy="2876550"/>
             <wp:effectExtent t="0" r="0" b="0" l="0"/>
-            <wp:docPr id="1" name="trajectory.png" descr="Figure 4. PROMIS Physical Function (T-score) over time, stratified by low versus high iliopsoas fatty infiltration (median split). Error bars, 95% CI; dotted line, US population norm (T=50)." title="Figure 4. PROMIS Physical Function (T-score) over time, stratified by low versus high iliopsoas fatty infiltration (median split). Error bars, 95% CI; dotted line, US population norm (T=50)."/>
+            <wp:docPr id="1" name="mcid_by_tertile.png" descr="Figure 4. Percentage achieving ODI and PROMIS Physical Function MCID at one year across iliopsoas T2-heterogeneity tertiles. Error bars, Wilson 95% CI; n per bar." title="Figure 4. Percentage achieving ODI and PROMIS Physical Function MCID at one year across iliopsoas T2-heterogeneity tertiles. Error bars, Wilson 95% CI; n per bar."/>
             <wp:cNvGraphicFramePr>
               <a:graphicFrameLocks xmlns:a="http://schemas.openxmlformats.org/drawingml/2006/main" noChangeAspect="1"/>
             </wp:cNvGraphicFramePr>
@@ -350,7 +350,7 @@
                   <pic:spPr bwMode="auto">
                     <a:xfrm>
                       <a:off x="0" y="0"/>
-                      <a:ext cx="4476750" cy="3133725"/>
+                      <a:ext cx="5143500" cy="2876550"/>
                     </a:xfrm>
                     <a:prstGeom prst="rect">
                       <a:avLst/>
@@ -374,7 +374,7 @@
           <w:sz w:val="18"/>
           <w:szCs w:val="18"/>
         </w:rPr>
-        <w:t xml:space="preserve">Figure 4. PROMIS Physical Function (T-score) over time, stratified by low versus high iliopsoas fatty infiltration (median split). Error bars, 95% CI; dotted line, US population norm (T=50).</w:t>
+        <w:t xml:space="preserve">Figure 4. Percentage achieving ODI and PROMIS Physical Function MCID at one year across iliopsoas T2-heterogeneity tertiles. Error bars, Wilson 95% CI; n per bar.</w:t>
       </w:r>
     </w:p>
     <w:p>
@@ -387,7 +387,7 @@
           <wp:inline distT="0" distB="0" distL="0" distR="0">
             <wp:extent cx="5143500" cy="4591050"/>
             <wp:effectExtent t="0" r="0" b="0" l="0"/>
-            <wp:docPr id="1" name="forest_pf_legpain.png" descr="Figure 5. Adjusted per-SD associations (ANCOVA) of each muscle exposure with one-year PROMIS Physical Function (continuous) and the leg-pain negative control; reference line at 0." title="Figure 5. Adjusted per-SD associations (ANCOVA) of each muscle exposure with one-year PROMIS Physical Function (continuous) and the leg-pain negative control; reference line at 0."/>
+            <wp:docPr id="1" name="forest_pf_legpain.png" descr="Figure 5. Per-SD associations of each muscle exposure with one-year PROMIS Physical Function (continuous) and the leg-pain negative control; reference line at 0." title="Figure 5. Per-SD associations of each muscle exposure with one-year PROMIS Physical Function (continuous) and the leg-pain negative control; reference line at 0."/>
             <wp:cNvGraphicFramePr>
               <a:graphicFrameLocks xmlns:a="http://schemas.openxmlformats.org/drawingml/2006/main" noChangeAspect="1"/>
             </wp:cNvGraphicFramePr>
@@ -434,7 +434,7 @@
           <w:sz w:val="18"/>
           <w:szCs w:val="18"/>
         </w:rPr>
-        <w:t xml:space="preserve">Figure 5. Adjusted per-SD associations (ANCOVA) of each muscle exposure with one-year PROMIS Physical Function (continuous) and the leg-pain negative control; reference line at 0.</w:t>
+        <w:t xml:space="preserve">Figure 5. Per-SD associations of each muscle exposure with one-year PROMIS Physical Function (continuous) and the leg-pain negative control; reference line at 0.</w:t>
       </w:r>
     </w:p>
     <w:p>
@@ -449,7 +449,7 @@
           <w:sz w:val="16"/>
           <w:szCs w:val="16"/>
         </w:rPr>
-        <w:t xml:space="preserve">Exploratory analysis; the fatty-infiltration index is an imaging proxy pending validation against a quantitative fat fraction. Generated from the analysis pipeline in this repository (code only; no patient data).</w:t>
+        <w:t xml:space="preserve">Conventional T2 signal is a proxy pending validation against quantitative fat-water imaging; the heterogeneity result is hypothesis-generating. Generated from the analysis pipeline in this repository (code only; no patient data).</w:t>
       </w:r>
     </w:p>
     <w:sectPr>

</xml_diff>

<commit_message>
Fix outcome-naming inconsistency: PROMIS Global Physical Health
The primary timecourse outcome is the PROMIS Global-10 Physical Health subscore;
Results/figure/docstring had shortened it to 'PROMIS Physical Health', risking
confusion with the distinct PROMIS Physical Function instrument used for the MCID
analysis. Standardized to 'PROMIS Global Physical Health (PH)' throughout and
rebuilt the figure and Word package. No change to data or estimates.
</commit_message>
<xml_diff>
--- a/docs/Abstract_with_figures.docx
+++ b/docs/Abstract_with_figures.docx
@@ -111,7 +111,7 @@
         <w:t xml:space="preserve">Results.  </w:t>
       </w:r>
       <w:r>
-        <w:t xml:space="preserve">Higher cord-normalized iliopsoas T2 predicted greater improvement in PROMIS Physical Health at 3 months (β=+1.11; 95% CI 0.54 to 1.69; p&lt;0.001) and greater ODI reduction at 3 months (β=−3.05; −5.19 to −0.90; p=0.005) and 1 year (β=−2.40; −4.48 to −0.32; p=0.023); the deep back muscle showed concordant 3-month effects (PH p=0.027; ODI p=0.050). Greater iliopsoas T2 heterogeneity predicted lower odds of ODI MCID (OR 0.60; 0.40 to 0.91; p=0.015) and PROMIS-PF MCID (OR 0.70; 0.48 to 1.02; p=0.06), independent of volume. Volume and back/leg pain showed no associations.</w:t>
+        <w:t xml:space="preserve">Higher cord-normalized iliopsoas T2 predicted greater improvement in PROMIS Global Physical Health (PH) at 3 months (β=+1.11; 95% CI 0.54 to 1.69; p&lt;0.001) and greater ODI reduction at 3 months (β=−3.05; −5.19 to −0.90; p=0.005) and 1 year (β=−2.40; −4.48 to −0.32; p=0.023); the deep back muscle showed concordant 3-month effects (PH p=0.027; ODI p=0.050). Greater iliopsoas T2 heterogeneity predicted lower odds of ODI MCID (OR 0.60; 0.40 to 0.91; p=0.015) and PROMIS-PF MCID (OR 0.70; 0.48 to 1.02; p=0.06), independent of volume. Volume and back/leg pain showed no associations.</w:t>
       </w:r>
     </w:p>
     <w:p>
@@ -147,7 +147,7 @@
           <wp:inline distT="0" distB="0" distL="0" distR="0">
             <wp:extent cx="5143500" cy="5143500"/>
             <wp:effectExtent t="0" r="0" b="0" l="0"/>
-            <wp:docPr id="1" name="forest_t2_timecourse.png" descr="Figure 1. Primary analysis. Adjusted per-SD effect of cord-normalized paraspinal and iliopsoas T2 signal on change in PROMIS Physical Health and the Oswestry Disability Index across postoperative timepoints (age-, sex-, and baseline-adjusted; HC3 robust SE). For PH, positive values indicate improvement; for ODI, negative values indicate improvement. Reference line at 0." title="Figure 1. Primary analysis. Adjusted per-SD effect of cord-normalized paraspinal and iliopsoas T2 signal on change in PROMIS Physical Health and the Oswestry Disability Index across postoperative timepoints (age-, sex-, and baseline-adjusted; HC3 robust SE). For PH, positive values indicate improvement; for ODI, negative values indicate improvement. Reference line at 0."/>
+            <wp:docPr id="1" name="forest_t2_timecourse.png" descr="Figure 1. Primary analysis. Adjusted per-SD effect of cord-normalized paraspinal and iliopsoas T2 signal on change in PROMIS Global Physical Health and the Oswestry Disability Index across postoperative timepoints (age-, sex-, and baseline-adjusted; HC3 robust SE). For PH, positive values indicate improvement; for ODI, negative values indicate improvement. Reference line at 0." title="Figure 1. Primary analysis. Adjusted per-SD effect of cord-normalized paraspinal and iliopsoas T2 signal on change in PROMIS Global Physical Health and the Oswestry Disability Index across postoperative timepoints (age-, sex-, and baseline-adjusted; HC3 robust SE). For PH, positive values indicate improvement; for ODI, negative values indicate improvement. Reference line at 0."/>
             <wp:cNvGraphicFramePr>
               <a:graphicFrameLocks xmlns:a="http://schemas.openxmlformats.org/drawingml/2006/main" noChangeAspect="1"/>
             </wp:cNvGraphicFramePr>
@@ -194,7 +194,7 @@
           <w:sz w:val="18"/>
           <w:szCs w:val="18"/>
         </w:rPr>
-        <w:t xml:space="preserve">Figure 1. Primary analysis. Adjusted per-SD effect of cord-normalized paraspinal and iliopsoas T2 signal on change in PROMIS Physical Health and the Oswestry Disability Index across postoperative timepoints (age-, sex-, and baseline-adjusted; HC3 robust SE). For PH, positive values indicate improvement; for ODI, negative values indicate improvement. Reference line at 0.</w:t>
+        <w:t xml:space="preserve">Figure 1. Primary analysis. Adjusted per-SD effect of cord-normalized paraspinal and iliopsoas T2 signal on change in PROMIS Global Physical Health and the Oswestry Disability Index across postoperative timepoints (age-, sex-, and baseline-adjusted; HC3 robust SE). For PH, positive values indicate improvement; for ODI, negative values indicate improvement. Reference line at 0.</w:t>
       </w:r>
     </w:p>
     <w:p>

</xml_diff>

<commit_message>
Add Global Physical Health MCID; report heterogeneity finding as exploratory
Adds a PROMIS Global Physical Health MCID flag so the secondary responder
analysis uses the same instrument as the primary timecourse. The iliopsoas
T2-heterogeneity association is significant for ODI MCID only (OR 0.60, p=0.015)
and does NOT replicate on Global Physical Health MCID (OR 1.06, p=0.75) or
PROMIS-PF MCID (OR 0.70, p=0.06). Abstract, MCID forest (now three instruments),
and Word package updated to present this honestly as an exploratory, ODI-specific
signal that did not replicate across instruments.
</commit_message>
<xml_diff>
--- a/docs/Abstract_with_figures.docx
+++ b/docs/Abstract_with_figures.docx
@@ -111,7 +111,7 @@
         <w:t xml:space="preserve">Results.  </w:t>
       </w:r>
       <w:r>
-        <w:t xml:space="preserve">Higher cord-normalized iliopsoas T2 predicted greater improvement in PROMIS Global Physical Health (PH) at 3 months (β=+1.11; 95% CI 0.54 to 1.69; p&lt;0.001) and greater ODI reduction at 3 months (β=−3.05; −5.19 to −0.90; p=0.005) and 1 year (β=−2.40; −4.48 to −0.32; p=0.023); the deep back muscle showed concordant 3-month effects (PH p=0.027; ODI p=0.050). Greater iliopsoas T2 heterogeneity predicted lower odds of ODI MCID (OR 0.60; 0.40 to 0.91; p=0.015) and PROMIS-PF MCID (OR 0.70; 0.48 to 1.02; p=0.06), independent of volume. Volume and back/leg pain showed no associations.</w:t>
+        <w:t xml:space="preserve">Higher cord-normalized iliopsoas T2 predicted greater improvement in PROMIS Global Physical Health (PH) at 3 months (β=+1.11; 95% CI 0.54 to 1.69; p&lt;0.001) and greater ODI reduction at 3 months (β=−3.05; −5.19 to −0.90; p=0.005) and 1 year (β=−2.40; −4.48 to −0.32; p=0.023); the deep back muscle showed concordant 3-month effects (PH p=0.027; ODI p=0.050). In an exploratory analysis, greater iliopsoas T2 heterogeneity was associated with lower odds of ODI MCID (OR 0.60; 0.40 to 0.91; p=0.015), but this did not replicate for PROMIS Physical Function or Global Physical Health MCID. Muscle volume and back and leg pain showed no associations.</w:t>
       </w:r>
     </w:p>
     <w:p>
@@ -126,7 +126,7 @@
         <w:t xml:space="preserve">Conclusion.  </w:t>
       </w:r>
       <w:r>
-        <w:t xml:space="preserve">Scanner-normalized paraspinal and iliopsoas T2 signal independently predicted early functional and disability improvement after lumbar decompression, including a durable 1-year disability effect not evident in unadjusted raw-signal analyses, whereas greater T2 heterogeneity predicted lower odds of clinically meaningful improvement. Higher T2 tracking better recovery suggests reversible edema or inflammation rather than chronic fat; quantitative fat-water imaging is warranted.</w:t>
+        <w:t xml:space="preserve">Scanner-normalized paraspinal and iliopsoas T2 signal independently predicted early functional and disability improvement after lumbar decompression, including a durable 1-year disability effect not evident in unadjusted raw-signal analyses; an exploratory association between greater T2 heterogeneity and lower odds of ODI MCID did not replicate across instruments. Higher T2 tracking better recovery suggests reversible edema or inflammation rather than chronic fat; quantitative fat-water imaging is warranted.</w:t>
       </w:r>
     </w:p>
     <w:p>
@@ -267,7 +267,7 @@
           <wp:inline distT="0" distB="0" distL="0" distR="0">
             <wp:extent cx="5334000" cy="4171950"/>
             <wp:effectExtent t="0" r="0" b="0" l="0"/>
-            <wp:docPr id="1" name="forest_mcid.png" descr="Figure 3. Secondary analysis. Adjusted odds ratios (per 1 SD) for achieving MCID at one year, contrasting muscle size (spine-normalized volume) with quality (T2 heterogeneity) for each muscle; reference line at OR=1." title="Figure 3. Secondary analysis. Adjusted odds ratios (per 1 SD) for achieving MCID at one year, contrasting muscle size (spine-normalized volume) with quality (T2 heterogeneity) for each muscle; reference line at OR=1."/>
+            <wp:docPr id="1" name="forest_mcid.png" descr="Figure 3. Exploratory secondary analysis. Adjusted odds ratios (per 1 SD) for achieving MCID at one year, contrasting muscle size (spine-normalized volume) with quality (T2 heterogeneity) for each muscle across three instruments (Global Physical Health, ODI, PROMIS Physical Function). The iliopsoas heterogeneity association is significant for ODI MCID only and does not replicate on the other instruments; reference line at OR=1." title="Figure 3. Exploratory secondary analysis. Adjusted odds ratios (per 1 SD) for achieving MCID at one year, contrasting muscle size (spine-normalized volume) with quality (T2 heterogeneity) for each muscle across three instruments (Global Physical Health, ODI, PROMIS Physical Function). The iliopsoas heterogeneity association is significant for ODI MCID only and does not replicate on the other instruments; reference line at OR=1."/>
             <wp:cNvGraphicFramePr>
               <a:graphicFrameLocks xmlns:a="http://schemas.openxmlformats.org/drawingml/2006/main" noChangeAspect="1"/>
             </wp:cNvGraphicFramePr>
@@ -314,7 +314,7 @@
           <w:sz w:val="18"/>
           <w:szCs w:val="18"/>
         </w:rPr>
-        <w:t xml:space="preserve">Figure 3. Secondary analysis. Adjusted odds ratios (per 1 SD) for achieving MCID at one year, contrasting muscle size (spine-normalized volume) with quality (T2 heterogeneity) for each muscle; reference line at OR=1.</w:t>
+        <w:t xml:space="preserve">Figure 3. Exploratory secondary analysis. Adjusted odds ratios (per 1 SD) for achieving MCID at one year, contrasting muscle size (spine-normalized volume) with quality (T2 heterogeneity) for each muscle across three instruments (Global Physical Health, ODI, PROMIS Physical Function). The iliopsoas heterogeneity association is significant for ODI MCID only and does not replicate on the other instruments; reference line at OR=1.</w:t>
       </w:r>
     </w:p>
     <w:p>

</xml_diff>